<commit_message>
Adicionando entrega projeto integrado DAII
</commit_message>
<xml_diff>
--- a/daii/projeto_integrado/entrega02.docx
+++ b/daii/projeto_integrado/entrega02.docx
@@ -259,6 +259,9 @@
         <w:jc w:val="center"/>
       </w:pPr>
       <w:r>
+        <w:rPr>
+          <w:noProof/>
+        </w:rPr>
         <w:drawing>
           <wp:inline distT="0" distB="0" distL="0" distR="0" wp14:anchorId="00278B08" wp14:editId="593E5AA5">
             <wp:extent cx="5400040" cy="1308735"/>
@@ -298,6 +301,50 @@
     </w:p>
     <w:p>
       <w:pPr>
+        <w:ind w:left="360"/>
+        <w:jc w:val="center"/>
+      </w:pPr>
+      <w:r>
+        <w:lastRenderedPageBreak/>
+        <w:drawing>
+          <wp:inline distT="0" distB="0" distL="0" distR="0" wp14:anchorId="4795BBCA" wp14:editId="050DA737">
+            <wp:extent cx="4006158" cy="1563551"/>
+            <wp:effectExtent l="0" t="0" r="0" b="0"/>
+            <wp:docPr id="579625572" name="Imagem 1" descr="Interface gráfica do usuário, Aplicativo&#10;&#10;O conteúdo gerado por IA pode estar incorreto."/>
+            <wp:cNvGraphicFramePr>
+              <a:graphicFrameLocks xmlns:a="http://schemas.openxmlformats.org/drawingml/2006/main" noChangeAspect="1"/>
+            </wp:cNvGraphicFramePr>
+            <a:graphic xmlns:a="http://schemas.openxmlformats.org/drawingml/2006/main">
+              <a:graphicData uri="http://schemas.openxmlformats.org/drawingml/2006/picture">
+                <pic:pic xmlns:pic="http://schemas.openxmlformats.org/drawingml/2006/picture">
+                  <pic:nvPicPr>
+                    <pic:cNvPr id="579625572" name="Imagem 1" descr="Interface gráfica do usuário, Aplicativo&#10;&#10;O conteúdo gerado por IA pode estar incorreto."/>
+                    <pic:cNvPicPr/>
+                  </pic:nvPicPr>
+                  <pic:blipFill>
+                    <a:blip r:embed="rId8"/>
+                    <a:stretch>
+                      <a:fillRect/>
+                    </a:stretch>
+                  </pic:blipFill>
+                  <pic:spPr>
+                    <a:xfrm>
+                      <a:off x="0" y="0"/>
+                      <a:ext cx="4019800" cy="1568875"/>
+                    </a:xfrm>
+                    <a:prstGeom prst="rect">
+                      <a:avLst/>
+                    </a:prstGeom>
+                  </pic:spPr>
+                </pic:pic>
+              </a:graphicData>
+            </a:graphic>
+          </wp:inline>
+        </w:drawing>
+      </w:r>
+    </w:p>
+    <w:p>
+      <w:pPr>
         <w:pStyle w:val="PargrafodaLista"/>
         <w:numPr>
           <w:ilvl w:val="0"/>
@@ -318,7 +365,9 @@
         <w:ind w:left="360"/>
       </w:pPr>
       <w:r>
-        <w:lastRenderedPageBreak/>
+        <w:rPr>
+          <w:noProof/>
+        </w:rPr>
         <w:drawing>
           <wp:inline distT="0" distB="0" distL="0" distR="0" wp14:anchorId="608B3B65" wp14:editId="3307B322">
             <wp:extent cx="5400040" cy="1030605"/>
@@ -335,7 +384,7 @@
                     <pic:cNvPicPr/>
                   </pic:nvPicPr>
                   <pic:blipFill>
-                    <a:blip r:embed="rId8"/>
+                    <a:blip r:embed="rId9"/>
                     <a:stretch>
                       <a:fillRect/>
                     </a:stretch>
@@ -373,6 +422,9 @@
         <w:ind w:left="360"/>
       </w:pPr>
       <w:r>
+        <w:rPr>
+          <w:noProof/>
+        </w:rPr>
         <w:drawing>
           <wp:inline distT="0" distB="0" distL="0" distR="0" wp14:anchorId="77B2823C" wp14:editId="72821900">
             <wp:extent cx="5400040" cy="2277110"/>
@@ -389,7 +441,7 @@
                     <pic:cNvPicPr/>
                   </pic:nvPicPr>
                   <pic:blipFill>
-                    <a:blip r:embed="rId9"/>
+                    <a:blip r:embed="rId10"/>
                     <a:stretch>
                       <a:fillRect/>
                     </a:stretch>
@@ -1126,6 +1178,7 @@
   <w:style w:type="character" w:default="1" w:styleId="Fontepargpadro">
     <w:name w:val="Default Paragraph Font"/>
     <w:uiPriority w:val="1"/>
+    <w:semiHidden/>
     <w:unhideWhenUsed/>
   </w:style>
   <w:style w:type="table" w:default="1" w:styleId="Tabelanormal">

</xml_diff>